<commit_message>
Deploying to gh-pages from @ Morrison-Lab/sds@c2fe18bc364d3fa4ff3d0e80d60545cc5683c415 🚀
</commit_message>
<xml_diff>
--- a/multiple-testing-handout.docx
+++ b/multiple-testing-handout.docx
@@ -15,7 +15,7 @@
         <w:pStyle w:val="Date"/>
       </w:pPr>
       <w:r>
-        <w:t xml:space="preserve">Last modified: 2026-10-14 01:59:19 (PDT)</w:t>
+        <w:t xml:space="preserve">Last modified: 2026-10-14 13:15:49 (PDT)</w:t>
       </w:r>
     </w:p>
     <w:p>
@@ -14779,7 +14779,7 @@
         <w:t xml:space="preserve"> </w:t>
       </w:r>
       <w:r>
-        <w:t xml:space="preserve">The Bonferroni correction pays for this with power:</w:t>
+        <w:t xml:space="preserve">The Bonferroni correction loses power in exchange:</w:t>
       </w:r>
       <w:r>
         <w:t xml:space="preserve"> </w:t>

</xml_diff>

<commit_message>
Deploying to gh-pages from @ Morrison-Lab/sds@3e74d0b1e22b4de5ceec38c38a72db04802f0d53 🚀
</commit_message>
<xml_diff>
--- a/multiple-testing-handout.docx
+++ b/multiple-testing-handout.docx
@@ -15,7 +15,7 @@
         <w:pStyle w:val="Date"/>
       </w:pPr>
       <w:r>
-        <w:t xml:space="preserve">Last modified: 2026-10-15 02:43:30 (PDT)</w:t>
+        <w:t xml:space="preserve">Last modified: 2026-10-15 02:58:11 (PDT)</w:t>
       </w:r>
     </w:p>
     <w:p>
@@ -573,7 +573,7 @@
       </w:r>
     </w:p>
     <w:bookmarkEnd w:id="14"/>
-    <w:bookmarkStart w:id="27" w:name="sec-multiplicity"/>
+    <w:bookmarkStart w:id="28" w:name="sec-multiplicity"/>
     <w:p>
       <w:pPr>
         <w:pStyle w:val="Heading2"/>
@@ -582,7 +582,7 @@
         <w:t xml:space="preserve">2 The multiplicity problem</w:t>
       </w:r>
     </w:p>
-    <w:bookmarkStart w:id="19" w:name="sec-false-positive-chance"/>
+    <w:bookmarkStart w:id="20" w:name="sec-false-positive-chance"/>
     <w:p>
       <w:pPr>
         <w:pStyle w:val="Heading3"/>
@@ -1635,10 +1635,349 @@
       </m:oMathPara>
     </w:p>
     <w:bookmarkEnd w:id="16"/>
-    <w:bookmarkStart w:id="17" w:name="thm-false-positive-prob"/>
+    <w:bookmarkStart w:id="17" w:name="lem-no-rejection-prob"/>
     <w:p>
       <w:pPr>
         <w:pStyle w:val="FirstParagraph"/>
+      </w:pPr>
+      <w:r>
+        <w:rPr>
+          <w:b/>
+          <w:bCs/>
+        </w:rPr>
+        <w:t xml:space="preserve">Lemma 1 (Probability that no test rejects)</w:t>
+      </w:r>
+      <w:r>
+        <w:t xml:space="preserve"> </w:t>
+      </w:r>
+      <w:r>
+        <w:t xml:space="preserve">Let</w:t>
+      </w:r>
+      <w:r>
+        <w:t xml:space="preserve"> </w:t>
+      </w:r>
+      <m:oMath>
+        <m:sSub>
+          <m:e>
+            <m:r>
+              <m:t>A</m:t>
+            </m:r>
+          </m:e>
+          <m:sub>
+            <m:r>
+              <m:t>1</m:t>
+            </m:r>
+          </m:sub>
+        </m:sSub>
+        <m:r>
+          <m:rPr>
+            <m:sty m:val="p"/>
+          </m:rPr>
+          <m:t>,</m:t>
+        </m:r>
+        <m:r>
+          <m:rPr>
+            <m:sty m:val="p"/>
+          </m:rPr>
+          <m:t>…</m:t>
+        </m:r>
+        <m:r>
+          <m:rPr>
+            <m:sty m:val="p"/>
+          </m:rPr>
+          <m:t>,</m:t>
+        </m:r>
+        <m:sSub>
+          <m:e>
+            <m:r>
+              <m:t>A</m:t>
+            </m:r>
+          </m:e>
+          <m:sub>
+            <m:r>
+              <m:t>m</m:t>
+            </m:r>
+          </m:sub>
+        </m:sSub>
+      </m:oMath>
+      <w:r>
+        <w:t xml:space="preserve"> </w:t>
+      </w:r>
+      <w:r>
+        <w:t xml:space="preserve">be independent events,</w:t>
+      </w:r>
+      <w:r>
+        <w:t xml:space="preserve"> </w:t>
+      </w:r>
+      <w:r>
+        <w:t xml:space="preserve">where</w:t>
+      </w:r>
+      <w:r>
+        <w:t xml:space="preserve"> </w:t>
+      </w:r>
+      <m:oMath>
+        <m:sSub>
+          <m:e>
+            <m:r>
+              <m:t>A</m:t>
+            </m:r>
+          </m:e>
+          <m:sub>
+            <m:r>
+              <m:t>j</m:t>
+            </m:r>
+          </m:sub>
+        </m:sSub>
+      </m:oMath>
+      <w:r>
+        <w:t xml:space="preserve"> </w:t>
+      </w:r>
+      <w:r>
+        <w:t xml:space="preserve">is the event that the</w:t>
+      </w:r>
+      <w:r>
+        <w:t xml:space="preserve"> </w:t>
+      </w:r>
+      <m:oMath>
+        <m:r>
+          <m:t>j</m:t>
+        </m:r>
+      </m:oMath>
+      <w:r>
+        <w:t xml:space="preserve">th of</w:t>
+      </w:r>
+      <w:r>
+        <w:t xml:space="preserve"> </w:t>
+      </w:r>
+      <m:oMath>
+        <m:r>
+          <m:t>m</m:t>
+        </m:r>
+      </m:oMath>
+      <w:r>
+        <w:t xml:space="preserve"> </w:t>
+      </w:r>
+      <w:r>
+        <w:t xml:space="preserve">tests rejects its true null hypothesis,</w:t>
+      </w:r>
+      <w:r>
+        <w:t xml:space="preserve"> </w:t>
+      </w:r>
+      <w:r>
+        <w:t xml:space="preserve">and each has probability</w:t>
+      </w:r>
+      <w:r>
+        <w:t xml:space="preserve"> </w:t>
+      </w:r>
+      <m:oMath>
+        <m:r>
+          <m:rPr>
+            <m:sty m:val="p"/>
+          </m:rPr>
+          <m:t>Pr</m:t>
+        </m:r>
+        <m:r>
+          <m:rPr>
+            <m:sty m:val="p"/>
+          </m:rPr>
+          <m:t>(</m:t>
+        </m:r>
+        <m:sSub>
+          <m:e>
+            <m:r>
+              <m:t>A</m:t>
+            </m:r>
+          </m:e>
+          <m:sub>
+            <m:r>
+              <m:t>j</m:t>
+            </m:r>
+          </m:sub>
+        </m:sSub>
+        <m:r>
+          <m:rPr>
+            <m:sty m:val="p"/>
+          </m:rPr>
+          <m:t>)</m:t>
+        </m:r>
+        <m:r>
+          <m:rPr>
+            <m:sty m:val="p"/>
+          </m:rPr>
+          <m:t>=</m:t>
+        </m:r>
+        <m:r>
+          <m:t>α</m:t>
+        </m:r>
+      </m:oMath>
+      <w:r>
+        <w:t xml:space="preserve"> </w:t>
+      </w:r>
+      <w:r>
+        <w:t xml:space="preserve">(see</w:t>
+      </w:r>
+      <w:r>
+        <w:t xml:space="preserve"> </w:t>
+      </w:r>
+      <w:hyperlink r:id="rId10">
+        <w:r>
+          <w:rPr>
+            <w:rStyle w:val="Hyperlink"/>
+          </w:rPr>
+          <w:t xml:space="preserve">significance level</w:t>
+        </w:r>
+      </w:hyperlink>
+      <w:r>
+        <w:t xml:space="preserve">).</w:t>
+      </w:r>
+      <w:r>
+        <w:t xml:space="preserve"> </w:t>
+      </w:r>
+      <w:r>
+        <w:t xml:space="preserve">Then the probability that none of the tests rejects is</w:t>
+      </w:r>
+    </w:p>
+    <w:p>
+      <w:pPr>
+        <w:pStyle w:val="BodyText"/>
+      </w:pPr>
+      <m:oMathPara>
+        <m:oMathParaPr>
+          <m:jc m:val="center"/>
+        </m:oMathParaPr>
+        <m:oMath>
+          <m:r>
+            <m:rPr>
+              <m:sty m:val="p"/>
+            </m:rPr>
+            <m:t>Pr</m:t>
+          </m:r>
+          <m:r>
+            <m:t>​</m:t>
+          </m:r>
+          <m:d>
+            <m:dPr>
+              <m:begChr m:val="("/>
+              <m:sepChr m:val=""/>
+              <m:endChr m:val=")"/>
+              <m:grow/>
+            </m:dPr>
+            <m:e>
+              <m:r>
+                <m:rPr>
+                  <m:nor/>
+                  <m:sty m:val="p"/>
+                </m:rPr>
+                <m:t>no test rejects</m:t>
+              </m:r>
+            </m:e>
+          </m:d>
+          <m:r>
+            <m:t>​</m:t>
+          </m:r>
+          <m:r>
+            <m:rPr>
+              <m:sty m:val="p"/>
+            </m:rPr>
+            <m:t>=</m:t>
+          </m:r>
+          <m:r>
+            <m:t>​</m:t>
+          </m:r>
+          <m:d>
+            <m:dPr>
+              <m:begChr m:val="("/>
+              <m:sepChr m:val=""/>
+              <m:endChr m:val=")"/>
+              <m:grow/>
+            </m:dPr>
+            <m:e>
+              <m:r>
+                <m:t>1</m:t>
+              </m:r>
+              <m:r>
+                <m:rPr>
+                  <m:sty m:val="p"/>
+                </m:rPr>
+                <m:t>−</m:t>
+              </m:r>
+              <m:r>
+                <m:t>α</m:t>
+              </m:r>
+            </m:e>
+          </m:d>
+          <m:sSup>
+            <m:e>
+              <m:r>
+                <m:t>​</m:t>
+              </m:r>
+            </m:e>
+            <m:sup>
+              <m:r>
+                <m:t>m</m:t>
+              </m:r>
+            </m:sup>
+          </m:sSup>
+          <m:r>
+            <m:rPr>
+              <m:sty m:val="p"/>
+            </m:rPr>
+            <m:t>.</m:t>
+          </m:r>
+        </m:oMath>
+      </m:oMathPara>
+    </w:p>
+    <w:bookmarkEnd w:id="17"/>
+    <w:p>
+      <w:pPr>
+        <w:pStyle w:val="FirstParagraph"/>
+      </w:pPr>
+      <w:r>
+        <w:rPr>
+          <w:i/>
+          <w:iCs/>
+        </w:rPr>
+        <w:t xml:space="preserve">Proof</w:t>
+      </w:r>
+      <w:r>
+        <w:t xml:space="preserve">. </w:t>
+      </w:r>
+      <w:r>
+        <w:t xml:space="preserve">This is the solution to</w:t>
+      </w:r>
+      <w:r>
+        <w:t xml:space="preserve"> </w:t>
+      </w:r>
+      <w:hyperlink w:anchor="exr-no-rejection-prob">
+        <w:r>
+          <w:rPr>
+            <w:rStyle w:val="Hyperlink"/>
+          </w:rPr>
+          <w:t xml:space="preserve">Exercise 1</w:t>
+        </w:r>
+      </w:hyperlink>
+      <w:r>
+        <w:t xml:space="preserve">, worked in</w:t>
+      </w:r>
+      <w:r>
+        <w:t xml:space="preserve"> </w:t>
+      </w:r>
+      <w:hyperlink w:anchor="sol-no-rejection-prob">
+        <w:r>
+          <w:rPr>
+            <w:rStyle w:val="Hyperlink"/>
+          </w:rPr>
+          <w:t xml:space="preserve">Solution 1</w:t>
+        </w:r>
+      </w:hyperlink>
+      <w:r>
+        <w:t xml:space="preserve">.</w:t>
+      </w:r>
+    </w:p>
+    <w:bookmarkStart w:id="18" w:name="thm-false-positive-prob"/>
+    <w:p>
+      <w:pPr>
+        <w:pStyle w:val="BodyText"/>
       </w:pPr>
       <w:r>
         <w:rPr>
@@ -1936,7 +2275,7 @@
         </m:oMath>
       </m:oMathPara>
     </w:p>
-    <w:bookmarkEnd w:id="17"/>
+    <w:bookmarkEnd w:id="18"/>
     <w:p>
       <w:pPr>
         <w:pStyle w:val="FirstParagraph"/>
@@ -1957,12 +2296,12 @@
       <w:r>
         <w:t xml:space="preserve"> </w:t>
       </w:r>
-      <w:hyperlink w:anchor="sol-no-rejection-prob">
+      <w:hyperlink w:anchor="lem-no-rejection-prob">
         <w:r>
           <w:rPr>
             <w:rStyle w:val="Hyperlink"/>
           </w:rPr>
-          <w:t xml:space="preserve">Solution 1</w:t>
+          <w:t xml:space="preserve">Lemma 1</w:t>
         </w:r>
       </w:hyperlink>
       <w:r>
@@ -2346,7 +2685,7 @@
         </m:oMath>
       </m:oMathPara>
     </w:p>
-    <w:bookmarkStart w:id="18" w:name="exm-false-positive-prob"/>
+    <w:bookmarkStart w:id="19" w:name="exm-false-positive-prob"/>
     <w:p>
       <w:pPr>
         <w:pStyle w:val="FirstParagraph"/>
@@ -3036,9 +3375,9 @@
         <w:t xml:space="preserve">so a false positive is a near certainty.</w:t>
       </w:r>
     </w:p>
-    <w:bookmarkEnd w:id="18"/>
     <w:bookmarkEnd w:id="19"/>
-    <w:bookmarkStart w:id="26" w:name="sec-khan-tests"/>
+    <w:bookmarkEnd w:id="20"/>
+    <w:bookmarkStart w:id="27" w:name="sec-khan-tests"/>
     <w:p>
       <w:pPr>
         <w:pStyle w:val="Heading3"/>
@@ -3047,7 +3386,7 @@
         <w:t xml:space="preserve">2.2 Testing every gene</w:t>
       </w:r>
     </w:p>
-    <w:bookmarkStart w:id="25" w:name="exm-khan-pvalues"/>
+    <w:bookmarkStart w:id="26" w:name="exm-khan-pvalues"/>
     <w:p>
       <w:pPr>
         <w:pStyle w:val="FirstParagraph"/>
@@ -3068,7 +3407,7 @@
       <w:r>
         <w:t xml:space="preserve"> </w:t>
       </w:r>
-      <w:hyperlink r:id="rId20">
+      <w:hyperlink r:id="rId21">
         <w:r>
           <w:rPr>
             <w:rStyle w:val="Hyperlink"/>
@@ -3871,7 +4210,7 @@
       <w:tr>
         <w:tc>
           <w:tcPr/>
-          <w:bookmarkStart w:id="24" w:name="fig-khan-p-hist"/>
+          <w:bookmarkStart w:id="25" w:name="fig-khan-p-hist"/>
           <w:p>
             <w:pPr>
               <w:pStyle w:val="Compact"/>
@@ -3882,18 +4221,18 @@
                 <wp:inline>
                   <wp:extent cx="4620126" cy="3696101"/>
                   <wp:effectExtent b="0" l="0" r="0" t="0"/>
-                  <wp:docPr descr="" title="" id="22" name="Picture"/>
+                  <wp:docPr descr="" title="" id="23" name="Picture"/>
                   <a:graphic>
                     <a:graphicData uri="http://schemas.openxmlformats.org/drawingml/2006/picture">
                       <pic:pic>
                         <pic:nvPicPr>
-                          <pic:cNvPr descr="multiple-testing_files/figure-docx/fig-khan-p-hist-1.png" id="23" name="Picture"/>
+                          <pic:cNvPr descr="multiple-testing_files/figure-docx/fig-khan-p-hist-1.png" id="24" name="Picture"/>
                           <pic:cNvPicPr>
                             <a:picLocks noChangeArrowheads="1" noChangeAspect="1"/>
                           </pic:cNvPicPr>
                         </pic:nvPicPr>
                         <pic:blipFill>
-                          <a:blip r:embed="rId21"/>
+                          <a:blip r:embed="rId22"/>
                           <a:stretch>
                             <a:fillRect/>
                           </a:stretch>
@@ -3933,14 +4272,14 @@
               <w:t xml:space="preserve">Figure 1: Histogram of the 2308 Welch t-test p-values comparing tumor classes 2 and 4 in the Khan data.</w:t>
             </w:r>
           </w:p>
-          <w:bookmarkEnd w:id="24"/>
+          <w:bookmarkEnd w:id="25"/>
         </w:tc>
       </w:tr>
     </w:tbl>
-    <w:bookmarkEnd w:id="25"/>
     <w:bookmarkEnd w:id="26"/>
     <w:bookmarkEnd w:id="27"/>
-    <w:bookmarkStart w:id="52" w:name="sec-error-rates"/>
+    <w:bookmarkEnd w:id="28"/>
+    <w:bookmarkStart w:id="53" w:name="sec-error-rates"/>
     <w:p>
       <w:pPr>
         <w:pStyle w:val="Heading2"/>
@@ -3949,7 +4288,7 @@
         <w:t xml:space="preserve">3 Error rates for a family of tests</w:t>
       </w:r>
     </w:p>
-    <w:bookmarkStart w:id="32" w:name="sec-rejection-counts"/>
+    <w:bookmarkStart w:id="33" w:name="sec-rejection-counts"/>
     <w:p>
       <w:pPr>
         <w:pStyle w:val="Heading3"/>
@@ -3958,7 +4297,7 @@
         <w:t xml:space="preserve">3.1 Counting errors</w:t>
       </w:r>
     </w:p>
-    <w:bookmarkStart w:id="29" w:name="def-rejection-counts"/>
+    <w:bookmarkStart w:id="30" w:name="def-rejection-counts"/>
     <w:p>
       <w:pPr>
         <w:pStyle w:val="FirstParagraph"/>
@@ -4183,7 +4522,7 @@
       <w:tr>
         <w:tc>
           <w:tcPr/>
-          <w:bookmarkStart w:id="28" w:name="tbl-rejection-counts"/>
+          <w:bookmarkStart w:id="29" w:name="tbl-rejection-counts"/>
           <w:p>
             <w:pPr>
               <w:jc w:val="center"/>
@@ -4542,13 +4881,13 @@
               </w:tc>
             </w:tr>
           </w:tbl>
-          <w:bookmarkEnd w:id="28"/>
+          <w:bookmarkEnd w:id="29"/>
           <w:p/>
         </w:tc>
       </w:tr>
     </w:tbl>
-    <w:bookmarkEnd w:id="29"/>
-    <w:bookmarkStart w:id="30" w:name="exm-rejection-counts"/>
+    <w:bookmarkEnd w:id="30"/>
+    <w:bookmarkStart w:id="31" w:name="exm-rejection-counts"/>
     <w:p>
       <w:pPr>
         <w:pStyle w:val="BodyText"/>
@@ -6056,8 +6395,8 @@
         <w:t xml:space="preserve">48 were false positives.</w:t>
       </w:r>
     </w:p>
-    <w:bookmarkEnd w:id="30"/>
-    <w:bookmarkStart w:id="31" w:name="rem-counts-unobserved"/>
+    <w:bookmarkEnd w:id="31"/>
+    <w:bookmarkStart w:id="32" w:name="rem-counts-unobserved"/>
     <w:p>
       <w:pPr>
         <w:pStyle w:val="BodyText"/>
@@ -6248,9 +6587,9 @@
         <w:t xml:space="preserve">not of the particular list of rejections that one data set produces.</w:t>
       </w:r>
     </w:p>
-    <w:bookmarkEnd w:id="31"/>
     <w:bookmarkEnd w:id="32"/>
-    <w:bookmarkStart w:id="36" w:name="sec-fwer"/>
+    <w:bookmarkEnd w:id="33"/>
+    <w:bookmarkStart w:id="37" w:name="sec-fwer"/>
     <w:p>
       <w:pPr>
         <w:pStyle w:val="Heading3"/>
@@ -6259,7 +6598,7 @@
         <w:t xml:space="preserve">3.2 The family-wise error rate</w:t>
       </w:r>
     </w:p>
-    <w:bookmarkStart w:id="33" w:name="def-fwer"/>
+    <w:bookmarkStart w:id="34" w:name="def-fwer"/>
     <w:p>
       <w:pPr>
         <w:pStyle w:val="FirstParagraph"/>
@@ -6403,8 +6742,8 @@
         </m:oMath>
       </m:oMathPara>
     </w:p>
-    <w:bookmarkEnd w:id="33"/>
-    <w:bookmarkStart w:id="34" w:name="def-fwer-control"/>
+    <w:bookmarkEnd w:id="34"/>
+    <w:bookmarkStart w:id="35" w:name="def-fwer-control"/>
     <w:p>
       <w:pPr>
         <w:pStyle w:val="FirstParagraph"/>
@@ -6478,8 +6817,8 @@
         <w:t xml:space="preserve">for every possible set of true null hypotheses.</w:t>
       </w:r>
     </w:p>
-    <w:bookmarkEnd w:id="34"/>
-    <w:bookmarkStart w:id="35" w:name="exm-fwer"/>
+    <w:bookmarkEnd w:id="35"/>
+    <w:bookmarkStart w:id="36" w:name="exm-fwer"/>
     <w:p>
       <w:pPr>
         <w:pStyle w:val="BodyText"/>
@@ -7063,9 +7402,9 @@
         <w:t xml:space="preserve">predicts for tests that are independent.</w:t>
       </w:r>
     </w:p>
-    <w:bookmarkEnd w:id="35"/>
     <w:bookmarkEnd w:id="36"/>
-    <w:bookmarkStart w:id="45" w:name="sec-fdr"/>
+    <w:bookmarkEnd w:id="37"/>
+    <w:bookmarkStart w:id="46" w:name="sec-fdr"/>
     <w:p>
       <w:pPr>
         <w:pStyle w:val="Heading3"/>
@@ -7074,7 +7413,7 @@
         <w:t xml:space="preserve">3.3 The false discovery rate</w:t>
       </w:r>
     </w:p>
-    <w:bookmarkStart w:id="37" w:name="def-fdp"/>
+    <w:bookmarkStart w:id="38" w:name="def-fdp"/>
     <w:p>
       <w:pPr>
         <w:pStyle w:val="FirstParagraph"/>
@@ -7246,8 +7585,8 @@
         </m:oMath>
       </m:oMathPara>
     </w:p>
-    <w:bookmarkEnd w:id="37"/>
-    <w:bookmarkStart w:id="41" w:name="def-fdr"/>
+    <w:bookmarkEnd w:id="38"/>
+    <w:bookmarkStart w:id="42" w:name="def-fdr"/>
     <w:p>
       <w:pPr>
         <w:pStyle w:val="FirstParagraph"/>
@@ -7410,18 +7749,18 @@
                 <wp:inline>
                   <wp:extent cx="152400" cy="152400"/>
                   <wp:effectExtent b="0" l="0" r="0" t="0"/>
-                  <wp:docPr descr="" title="" id="39" name="Picture"/>
+                  <wp:docPr descr="" title="" id="40" name="Picture"/>
                   <a:graphic>
                     <a:graphicData uri="http://schemas.openxmlformats.org/drawingml/2006/picture">
                       <pic:pic>
                         <pic:nvPicPr>
-                          <pic:cNvPr descr="/opt/quarto/share/formats/docx/note.png" id="40" name="Picture"/>
+                          <pic:cNvPr descr="/opt/quarto/share/formats/docx/note.png" id="41" name="Picture"/>
                           <pic:cNvPicPr>
                             <a:picLocks noChangeArrowheads="1" noChangeAspect="1"/>
                           </pic:cNvPicPr>
                         </pic:nvPicPr>
                         <pic:blipFill>
-                          <a:blip r:embed="rId38"/>
+                          <a:blip r:embed="rId39"/>
                           <a:stretch>
                             <a:fillRect/>
                           </a:stretch>
@@ -7570,8 +7909,8 @@
         </w:tc>
       </w:tr>
     </w:tbl>
-    <w:bookmarkEnd w:id="41"/>
-    <w:bookmarkStart w:id="42" w:name="def-fdr-control"/>
+    <w:bookmarkEnd w:id="42"/>
+    <w:bookmarkStart w:id="43" w:name="def-fdr-control"/>
     <w:p>
       <w:pPr>
         <w:pStyle w:val="BodyText"/>
@@ -7645,8 +7984,8 @@
         <w:t xml:space="preserve">for every possible set of true null hypotheses.</w:t>
       </w:r>
     </w:p>
-    <w:bookmarkEnd w:id="42"/>
-    <w:bookmarkStart w:id="43" w:name="exm-fdr"/>
+    <w:bookmarkEnd w:id="43"/>
+    <w:bookmarkStart w:id="44" w:name="exm-fdr"/>
     <w:p>
       <w:pPr>
         <w:pStyle w:val="BodyText"/>
@@ -8203,8 +8542,8 @@
         <w:t xml:space="preserve">which is large next to the average of 85 true positives.</w:t>
       </w:r>
     </w:p>
-    <w:bookmarkEnd w:id="43"/>
-    <w:bookmarkStart w:id="44" w:name="rem-fdr-fwer"/>
+    <w:bookmarkEnd w:id="44"/>
+    <w:bookmarkStart w:id="45" w:name="rem-fdr-fwer"/>
     <w:p>
       <w:pPr>
         <w:pStyle w:val="BodyText"/>
@@ -8548,9 +8887,9 @@
         <w:t xml:space="preserve">where a few false positives are an acceptable price for more discoveries.</w:t>
       </w:r>
     </w:p>
-    <w:bookmarkEnd w:id="44"/>
     <w:bookmarkEnd w:id="45"/>
-    <w:bookmarkStart w:id="51" w:name="sec-valid-p-values"/>
+    <w:bookmarkEnd w:id="46"/>
+    <w:bookmarkStart w:id="52" w:name="sec-valid-p-values"/>
     <w:p>
       <w:pPr>
         <w:pStyle w:val="Heading3"/>
@@ -8559,7 +8898,7 @@
         <w:t xml:space="preserve">3.4 Valid p-values</w:t>
       </w:r>
     </w:p>
-    <w:bookmarkStart w:id="46" w:name="def-valid-p-value"/>
+    <w:bookmarkStart w:id="47" w:name="def-valid-p-value"/>
     <w:p>
       <w:pPr>
         <w:pStyle w:val="FirstParagraph"/>
@@ -8789,8 +9128,8 @@
         </m:oMath>
       </m:oMathPara>
     </w:p>
-    <w:bookmarkEnd w:id="46"/>
-    <w:bookmarkStart w:id="47" w:name="rem-valid-p-value-uniform"/>
+    <w:bookmarkEnd w:id="47"/>
+    <w:bookmarkStart w:id="48" w:name="rem-valid-p-value-uniform"/>
     <w:p>
       <w:pPr>
         <w:pStyle w:val="FirstParagraph"/>
@@ -8878,8 +9217,8 @@
         <w:t xml:space="preserve">.</w:t>
       </w:r>
     </w:p>
-    <w:bookmarkEnd w:id="47"/>
-    <w:bookmarkStart w:id="48" w:name="exm-valid-p-value"/>
+    <w:bookmarkEnd w:id="48"/>
+    <w:bookmarkStart w:id="49" w:name="exm-valid-p-value"/>
     <w:p>
       <w:pPr>
         <w:pStyle w:val="BodyText"/>
@@ -9501,8 +9840,8 @@
         <w:t xml:space="preserve">.</w:t>
       </w:r>
     </w:p>
-    <w:bookmarkEnd w:id="48"/>
-    <w:bookmarkStart w:id="50" w:name="rem-valid-p-value-discrete"/>
+    <w:bookmarkEnd w:id="49"/>
+    <w:bookmarkStart w:id="51" w:name="rem-valid-p-value-discrete"/>
     <w:p>
       <w:pPr>
         <w:pStyle w:val="BodyText"/>
@@ -9523,7 +9862,7 @@
       <w:r>
         <w:t xml:space="preserve"> </w:t>
       </w:r>
-      <w:hyperlink r:id="rId49">
+      <w:hyperlink r:id="rId50">
         <w:r>
           <w:rPr>
             <w:rStyle w:val="Hyperlink"/>
@@ -9632,10 +9971,10 @@
         <w:t xml:space="preserve">it rejects a true null hypothesis less often than its nominal level.</w:t>
       </w:r>
     </w:p>
-    <w:bookmarkEnd w:id="50"/>
     <w:bookmarkEnd w:id="51"/>
     <w:bookmarkEnd w:id="52"/>
-    <w:bookmarkStart w:id="75" w:name="sec-fwer-control"/>
+    <w:bookmarkEnd w:id="53"/>
+    <w:bookmarkStart w:id="79" w:name="sec-fwer-control"/>
     <w:p>
       <w:pPr>
         <w:pStyle w:val="Heading2"/>
@@ -9644,7 +9983,7 @@
         <w:t xml:space="preserve">4 Controlling the family-wise error rate</w:t>
       </w:r>
     </w:p>
-    <w:bookmarkStart w:id="65" w:name="sec-bonferroni"/>
+    <w:bookmarkStart w:id="68" w:name="sec-bonferroni"/>
     <w:p>
       <w:pPr>
         <w:pStyle w:val="Heading3"/>
@@ -9653,7 +9992,7 @@
         <w:t xml:space="preserve">4.1 The Bonferroni correction</w:t>
       </w:r>
     </w:p>
-    <w:bookmarkStart w:id="55" w:name="def-bonferroni"/>
+    <w:bookmarkStart w:id="56" w:name="def-bonferroni"/>
     <w:p>
       <w:pPr>
         <w:pStyle w:val="FirstParagraph"/>
@@ -9985,18 +10324,18 @@
                 <wp:inline>
                   <wp:extent cx="152400" cy="152400"/>
                   <wp:effectExtent b="0" l="0" r="0" t="0"/>
-                  <wp:docPr descr="" title="" id="53" name="Picture"/>
+                  <wp:docPr descr="" title="" id="54" name="Picture"/>
                   <a:graphic>
                     <a:graphicData uri="http://schemas.openxmlformats.org/drawingml/2006/picture">
                       <pic:pic>
                         <pic:nvPicPr>
-                          <pic:cNvPr descr="/opt/quarto/share/formats/docx/note.png" id="54" name="Picture"/>
+                          <pic:cNvPr descr="/opt/quarto/share/formats/docx/note.png" id="55" name="Picture"/>
                           <pic:cNvPicPr>
                             <a:picLocks noChangeArrowheads="1" noChangeAspect="1"/>
                           </pic:cNvPicPr>
                         </pic:nvPicPr>
                         <pic:blipFill>
-                          <a:blip r:embed="rId38"/>
+                          <a:blip r:embed="rId39"/>
                           <a:stretch>
                             <a:fillRect/>
                           </a:stretch>
@@ -10063,8 +10402,8 @@
         </w:tc>
       </w:tr>
     </w:tbl>
-    <w:bookmarkEnd w:id="55"/>
-    <w:bookmarkStart w:id="56" w:name="exm-bonferroni"/>
+    <w:bookmarkEnd w:id="56"/>
+    <w:bookmarkStart w:id="57" w:name="exm-bonferroni"/>
     <w:p>
       <w:pPr>
         <w:pStyle w:val="BodyText"/>
@@ -11446,8 +11785,8 @@
         </w:tc>
       </w:tr>
     </w:tbl>
-    <w:bookmarkEnd w:id="56"/>
-    <w:bookmarkStart w:id="57" w:name="exr-union-bound"/>
+    <w:bookmarkEnd w:id="57"/>
+    <w:bookmarkStart w:id="58" w:name="exr-union-bound"/>
     <w:p>
       <w:pPr>
         <w:pStyle w:val="BodyText"/>
@@ -11727,8 +12066,8 @@
         </m:oMath>
       </m:oMathPara>
     </w:p>
-    <w:bookmarkEnd w:id="57"/>
-    <w:bookmarkStart w:id="58" w:name="sol-union-bound"/>
+    <w:bookmarkEnd w:id="58"/>
+    <w:bookmarkStart w:id="59" w:name="sol-union-bound"/>
     <w:p>
       <w:pPr>
         <w:pStyle w:val="FirstParagraph"/>
@@ -12022,11 +12361,338 @@
         <w:t xml:space="preserve">The inequality holds.</w:t>
       </w:r>
     </w:p>
-    <w:bookmarkEnd w:id="58"/>
-    <w:bookmarkStart w:id="59" w:name="thm-union-bound"/>
+    <w:bookmarkEnd w:id="59"/>
+    <w:bookmarkStart w:id="60" w:name="lem-indicator-union"/>
     <w:p>
       <w:pPr>
         <w:pStyle w:val="FirstParagraph"/>
+      </w:pPr>
+      <w:r>
+        <w:rPr>
+          <w:b/>
+          <w:bCs/>
+        </w:rPr>
+        <w:t xml:space="preserve">Lemma 2 (The indicator of a union is at most the sum of the indicators)</w:t>
+      </w:r>
+      <w:r>
+        <w:t xml:space="preserve"> </w:t>
+      </w:r>
+      <w:r>
+        <w:t xml:space="preserve">For events</w:t>
+      </w:r>
+      <w:r>
+        <w:t xml:space="preserve"> </w:t>
+      </w:r>
+      <m:oMath>
+        <m:sSub>
+          <m:e>
+            <m:r>
+              <m:t>A</m:t>
+            </m:r>
+          </m:e>
+          <m:sub>
+            <m:r>
+              <m:t>1</m:t>
+            </m:r>
+          </m:sub>
+        </m:sSub>
+        <m:r>
+          <m:rPr>
+            <m:sty m:val="p"/>
+          </m:rPr>
+          <m:t>,</m:t>
+        </m:r>
+        <m:r>
+          <m:rPr>
+            <m:sty m:val="p"/>
+          </m:rPr>
+          <m:t>…</m:t>
+        </m:r>
+        <m:r>
+          <m:rPr>
+            <m:sty m:val="p"/>
+          </m:rPr>
+          <m:t>,</m:t>
+        </m:r>
+        <m:sSub>
+          <m:e>
+            <m:r>
+              <m:t>A</m:t>
+            </m:r>
+          </m:e>
+          <m:sub>
+            <m:r>
+              <m:t>k</m:t>
+            </m:r>
+          </m:sub>
+        </m:sSub>
+      </m:oMath>
+      <w:r>
+        <w:t xml:space="preserve">, let</w:t>
+      </w:r>
+      <w:r>
+        <w:t xml:space="preserve"> </w:t>
+      </w:r>
+      <m:oMath>
+        <m:sSub>
+          <m:e>
+            <m:r>
+              <m:rPr>
+                <m:scr m:val="double-struck"/>
+                <m:sty m:val="p"/>
+              </m:rPr>
+              <m:t>1</m:t>
+            </m:r>
+          </m:e>
+          <m:sub>
+            <m:r>
+              <m:t>A</m:t>
+            </m:r>
+          </m:sub>
+        </m:sSub>
+      </m:oMath>
+      <w:r>
+        <w:t xml:space="preserve"> </w:t>
+      </w:r>
+      <w:r>
+        <w:t xml:space="preserve">be the indicator of the event</w:t>
+      </w:r>
+      <w:r>
+        <w:t xml:space="preserve"> </w:t>
+      </w:r>
+      <m:oMath>
+        <m:r>
+          <m:t>A</m:t>
+        </m:r>
+      </m:oMath>
+      <w:r>
+        <w:t xml:space="preserve">:</w:t>
+      </w:r>
+      <w:r>
+        <w:t xml:space="preserve"> </w:t>
+      </w:r>
+      <w:r>
+        <w:t xml:space="preserve">it equals 1 if</w:t>
+      </w:r>
+      <w:r>
+        <w:t xml:space="preserve"> </w:t>
+      </w:r>
+      <m:oMath>
+        <m:r>
+          <m:t>A</m:t>
+        </m:r>
+      </m:oMath>
+      <w:r>
+        <w:t xml:space="preserve"> </w:t>
+      </w:r>
+      <w:r>
+        <w:t xml:space="preserve">occurs and 0 if it does not.</w:t>
+      </w:r>
+      <w:r>
+        <w:t xml:space="preserve"> </w:t>
+      </w:r>
+      <w:r>
+        <w:t xml:space="preserve">Then, for every outcome,</w:t>
+      </w:r>
+    </w:p>
+    <w:p>
+      <w:pPr>
+        <w:pStyle w:val="BodyText"/>
+      </w:pPr>
+      <m:oMathPara>
+        <m:oMathParaPr>
+          <m:jc m:val="center"/>
+        </m:oMathParaPr>
+        <m:oMath>
+          <m:sSub>
+            <m:e>
+              <m:r>
+                <m:rPr>
+                  <m:scr m:val="double-struck"/>
+                  <m:sty m:val="p"/>
+                </m:rPr>
+                <m:t>1</m:t>
+              </m:r>
+            </m:e>
+            <m:sub>
+              <m:sSub>
+                <m:e>
+                  <m:r>
+                    <m:t>A</m:t>
+                  </m:r>
+                </m:e>
+                <m:sub>
+                  <m:r>
+                    <m:t>1</m:t>
+                  </m:r>
+                </m:sub>
+              </m:sSub>
+              <m:r>
+                <m:rPr>
+                  <m:sty m:val="p"/>
+                </m:rPr>
+                <m:t>∪</m:t>
+              </m:r>
+              <m:r>
+                <m:rPr>
+                  <m:sty m:val="p"/>
+                </m:rPr>
+                <m:t>⋯</m:t>
+              </m:r>
+              <m:r>
+                <m:rPr>
+                  <m:sty m:val="p"/>
+                </m:rPr>
+                <m:t>∪</m:t>
+              </m:r>
+              <m:sSub>
+                <m:e>
+                  <m:r>
+                    <m:t>A</m:t>
+                  </m:r>
+                </m:e>
+                <m:sub>
+                  <m:r>
+                    <m:t>k</m:t>
+                  </m:r>
+                </m:sub>
+              </m:sSub>
+            </m:sub>
+          </m:sSub>
+          <m:r>
+            <m:rPr>
+              <m:sty m:val="p"/>
+            </m:rPr>
+            <m:t>≤</m:t>
+          </m:r>
+          <m:sSub>
+            <m:e>
+              <m:r>
+                <m:rPr>
+                  <m:scr m:val="double-struck"/>
+                  <m:sty m:val="p"/>
+                </m:rPr>
+                <m:t>1</m:t>
+              </m:r>
+            </m:e>
+            <m:sub>
+              <m:sSub>
+                <m:e>
+                  <m:r>
+                    <m:t>A</m:t>
+                  </m:r>
+                </m:e>
+                <m:sub>
+                  <m:r>
+                    <m:t>1</m:t>
+                  </m:r>
+                </m:sub>
+              </m:sSub>
+            </m:sub>
+          </m:sSub>
+          <m:r>
+            <m:rPr>
+              <m:sty m:val="p"/>
+            </m:rPr>
+            <m:t>+</m:t>
+          </m:r>
+          <m:r>
+            <m:rPr>
+              <m:sty m:val="p"/>
+            </m:rPr>
+            <m:t>⋯</m:t>
+          </m:r>
+          <m:r>
+            <m:rPr>
+              <m:sty m:val="p"/>
+            </m:rPr>
+            <m:t>+</m:t>
+          </m:r>
+          <m:sSub>
+            <m:e>
+              <m:r>
+                <m:rPr>
+                  <m:scr m:val="double-struck"/>
+                  <m:sty m:val="p"/>
+                </m:rPr>
+                <m:t>1</m:t>
+              </m:r>
+            </m:e>
+            <m:sub>
+              <m:sSub>
+                <m:e>
+                  <m:r>
+                    <m:t>A</m:t>
+                  </m:r>
+                </m:e>
+                <m:sub>
+                  <m:r>
+                    <m:t>k</m:t>
+                  </m:r>
+                </m:sub>
+              </m:sSub>
+            </m:sub>
+          </m:sSub>
+          <m:r>
+            <m:rPr>
+              <m:sty m:val="p"/>
+            </m:rPr>
+            <m:t>.</m:t>
+          </m:r>
+        </m:oMath>
+      </m:oMathPara>
+    </w:p>
+    <w:bookmarkEnd w:id="60"/>
+    <w:p>
+      <w:pPr>
+        <w:pStyle w:val="FirstParagraph"/>
+      </w:pPr>
+      <w:r>
+        <w:rPr>
+          <w:i/>
+          <w:iCs/>
+        </w:rPr>
+        <w:t xml:space="preserve">Proof</w:t>
+      </w:r>
+      <w:r>
+        <w:t xml:space="preserve">. </w:t>
+      </w:r>
+      <w:r>
+        <w:t xml:space="preserve">This is the solution to</w:t>
+      </w:r>
+      <w:r>
+        <w:t xml:space="preserve"> </w:t>
+      </w:r>
+      <w:hyperlink w:anchor="exr-union-bound">
+        <w:r>
+          <w:rPr>
+            <w:rStyle w:val="Hyperlink"/>
+          </w:rPr>
+          <w:t xml:space="preserve">Exercise 2</w:t>
+        </w:r>
+      </w:hyperlink>
+      <w:r>
+        <w:t xml:space="preserve">, worked in</w:t>
+      </w:r>
+      <w:r>
+        <w:t xml:space="preserve"> </w:t>
+      </w:r>
+      <w:hyperlink w:anchor="sol-union-bound">
+        <w:r>
+          <w:rPr>
+            <w:rStyle w:val="Hyperlink"/>
+          </w:rPr>
+          <w:t xml:space="preserve">Solution 2</w:t>
+        </w:r>
+      </w:hyperlink>
+      <w:r>
+        <w:t xml:space="preserve">.</w:t>
+      </w:r>
+    </w:p>
+    <w:bookmarkStart w:id="61" w:name="thm-union-bound"/>
+    <w:p>
+      <w:pPr>
+        <w:pStyle w:val="BodyText"/>
       </w:pPr>
       <w:r>
         <w:rPr>
@@ -12258,7 +12924,7 @@
         </m:oMath>
       </m:oMathPara>
     </w:p>
-    <w:bookmarkEnd w:id="59"/>
+    <w:bookmarkEnd w:id="61"/>
     <w:p>
       <w:pPr>
         <w:pStyle w:val="FirstParagraph"/>
@@ -12279,12 +12945,12 @@
       <w:r>
         <w:t xml:space="preserve"> </w:t>
       </w:r>
-      <w:hyperlink w:anchor="sol-union-bound">
+      <w:hyperlink w:anchor="lem-indicator-union">
         <w:r>
           <w:rPr>
             <w:rStyle w:val="Hyperlink"/>
           </w:rPr>
-          <w:t xml:space="preserve">Solution 2</w:t>
+          <w:t xml:space="preserve">Lemma 2</w:t>
         </w:r>
       </w:hyperlink>
       <w:r>
@@ -12822,7 +13488,7 @@
         </m:oMath>
       </m:oMathPara>
     </w:p>
-    <w:bookmarkStart w:id="60" w:name="exm-union-bound"/>
+    <w:bookmarkStart w:id="62" w:name="exm-union-bound"/>
     <w:p>
       <w:pPr>
         <w:pStyle w:val="FirstParagraph"/>
@@ -13121,8 +13787,8 @@
         <w:t xml:space="preserve">the bound exceeds 1 and says nothing.</w:t>
       </w:r>
     </w:p>
-    <w:bookmarkEnd w:id="60"/>
-    <w:bookmarkStart w:id="61" w:name="exr-bonferroni-fwer"/>
+    <w:bookmarkEnd w:id="62"/>
+    <w:bookmarkStart w:id="63" w:name="exr-bonferroni-fwer"/>
     <w:p>
       <w:pPr>
         <w:pStyle w:val="BodyText"/>
@@ -13351,8 +14017,8 @@
         <w:t xml:space="preserve">.</w:t>
       </w:r>
     </w:p>
-    <w:bookmarkEnd w:id="61"/>
-    <w:bookmarkStart w:id="62" w:name="sol-bonferroni-fwer"/>
+    <w:bookmarkEnd w:id="63"/>
+    <w:bookmarkStart w:id="64" w:name="sol-bonferroni-fwer"/>
     <w:p>
       <w:pPr>
         <w:pStyle w:val="BodyText"/>
@@ -14052,11 +14718,349 @@
         </m:oMath>
       </m:oMathPara>
     </w:p>
-    <w:bookmarkEnd w:id="62"/>
-    <w:bookmarkStart w:id="63" w:name="thm-bonferroni-fwer"/>
+    <w:bookmarkEnd w:id="64"/>
+    <w:bookmarkStart w:id="65" w:name="lem-bonferroni-false-positive-prob"/>
     <w:p>
       <w:pPr>
         <w:pStyle w:val="FirstParagraph"/>
+      </w:pPr>
+      <w:r>
+        <w:rPr>
+          <w:b/>
+          <w:bCs/>
+        </w:rPr>
+        <w:t xml:space="preserve">Lemma 3 (Probability of a false positive under the Bonferroni correction)</w:t>
+      </w:r>
+      <w:r>
+        <w:t xml:space="preserve"> </w:t>
+      </w:r>
+      <w:r>
+        <w:t xml:space="preserve">Let</w:t>
+      </w:r>
+      <w:r>
+        <w:t xml:space="preserve"> </w:t>
+      </w:r>
+      <m:oMath>
+        <m:r>
+          <m:t>m</m:t>
+        </m:r>
+      </m:oMath>
+      <w:r>
+        <w:t xml:space="preserve"> </w:t>
+      </w:r>
+      <w:r>
+        <w:t xml:space="preserve">null hypotheses have valid p-values (</w:t>
+      </w:r>
+      <w:hyperlink w:anchor="def-valid-p-value">
+        <w:r>
+          <w:rPr>
+            <w:rStyle w:val="Hyperlink"/>
+          </w:rPr>
+          <w:t xml:space="preserve">Definition 7</w:t>
+        </w:r>
+      </w:hyperlink>
+      <w:r>
+        <w:t xml:space="preserve">),</w:t>
+      </w:r>
+      <w:r>
+        <w:t xml:space="preserve"> </w:t>
+      </w:r>
+      <w:r>
+        <w:t xml:space="preserve">let</w:t>
+      </w:r>
+      <w:r>
+        <w:t xml:space="preserve"> </w:t>
+      </w:r>
+      <m:oMath>
+        <m:sSub>
+          <m:e>
+            <m:r>
+              <m:rPr>
+                <m:scr m:val="script"/>
+                <m:sty m:val="p"/>
+              </m:rPr>
+              <m:t>I</m:t>
+            </m:r>
+          </m:e>
+          <m:sub>
+            <m:r>
+              <m:t>0</m:t>
+            </m:r>
+          </m:sub>
+        </m:sSub>
+      </m:oMath>
+      <w:r>
+        <w:t xml:space="preserve"> </w:t>
+      </w:r>
+      <w:r>
+        <w:t xml:space="preserve">be the set of</w:t>
+      </w:r>
+      <w:r>
+        <w:t xml:space="preserve"> </w:t>
+      </w:r>
+      <m:oMath>
+        <m:sSub>
+          <m:e>
+            <m:r>
+              <m:t>m</m:t>
+            </m:r>
+          </m:e>
+          <m:sub>
+            <m:r>
+              <m:t>0</m:t>
+            </m:r>
+          </m:sub>
+        </m:sSub>
+      </m:oMath>
+      <w:r>
+        <w:t xml:space="preserve"> </w:t>
+      </w:r>
+      <w:r>
+        <w:t xml:space="preserve">indices of the true null hypotheses,</w:t>
+      </w:r>
+      <w:r>
+        <w:t xml:space="preserve"> </w:t>
+      </w:r>
+      <w:r>
+        <w:t xml:space="preserve">and let</w:t>
+      </w:r>
+      <w:r>
+        <w:t xml:space="preserve"> </w:t>
+      </w:r>
+      <m:oMath>
+        <m:r>
+          <m:t>V</m:t>
+        </m:r>
+      </m:oMath>
+      <w:r>
+        <w:t xml:space="preserve"> </w:t>
+      </w:r>
+      <w:r>
+        <w:t xml:space="preserve">be the number of true null hypotheses that the</w:t>
+      </w:r>
+      <w:r>
+        <w:t xml:space="preserve"> </w:t>
+      </w:r>
+      <w:hyperlink w:anchor="def-bonferroni">
+        <w:r>
+          <w:rPr>
+            <w:rStyle w:val="Hyperlink"/>
+          </w:rPr>
+          <w:t xml:space="preserve">Bonferroni correction</w:t>
+        </w:r>
+      </w:hyperlink>
+      <w:r>
+        <w:t xml:space="preserve"> </w:t>
+      </w:r>
+      <w:r>
+        <w:t xml:space="preserve">at level</w:t>
+      </w:r>
+      <w:r>
+        <w:t xml:space="preserve"> </w:t>
+      </w:r>
+      <m:oMath>
+        <m:r>
+          <m:t>α</m:t>
+        </m:r>
+      </m:oMath>
+      <w:r>
+        <w:t xml:space="preserve"> </w:t>
+      </w:r>
+      <w:r>
+        <w:t xml:space="preserve">rejects.</w:t>
+      </w:r>
+      <w:r>
+        <w:t xml:space="preserve"> </w:t>
+      </w:r>
+      <w:r>
+        <w:t xml:space="preserve">Then the probability that at least one true null hypothesis is rejected is at most</w:t>
+      </w:r>
+      <w:r>
+        <w:t xml:space="preserve"> </w:t>
+      </w:r>
+      <m:oMath>
+        <m:sSub>
+          <m:e>
+            <m:r>
+              <m:t>m</m:t>
+            </m:r>
+          </m:e>
+          <m:sub>
+            <m:r>
+              <m:t>0</m:t>
+            </m:r>
+          </m:sub>
+        </m:sSub>
+        <m:r>
+          <m:t>α</m:t>
+        </m:r>
+        <m:r>
+          <m:rPr>
+            <m:sty m:val="p"/>
+          </m:rPr>
+          <m:t>/</m:t>
+        </m:r>
+        <m:r>
+          <m:t>m</m:t>
+        </m:r>
+      </m:oMath>
+      <w:r>
+        <w:t xml:space="preserve">:</w:t>
+      </w:r>
+    </w:p>
+    <w:p>
+      <w:pPr>
+        <w:pStyle w:val="BodyText"/>
+      </w:pPr>
+      <m:oMathPara>
+        <m:oMathParaPr>
+          <m:jc m:val="center"/>
+        </m:oMathParaPr>
+        <m:oMath>
+          <m:r>
+            <m:rPr>
+              <m:sty m:val="p"/>
+            </m:rPr>
+            <m:t>Pr</m:t>
+          </m:r>
+          <m:r>
+            <m:t>​</m:t>
+          </m:r>
+          <m:d>
+            <m:dPr>
+              <m:begChr m:val="("/>
+              <m:sepChr m:val=""/>
+              <m:endChr m:val=")"/>
+              <m:grow/>
+            </m:dPr>
+            <m:e>
+              <m:r>
+                <m:t>V</m:t>
+              </m:r>
+              <m:r>
+                <m:rPr>
+                  <m:sty m:val="p"/>
+                </m:rPr>
+                <m:t>≥</m:t>
+              </m:r>
+              <m:r>
+                <m:t>1</m:t>
+              </m:r>
+            </m:e>
+          </m:d>
+          <m:r>
+            <m:t>​</m:t>
+          </m:r>
+          <m:r>
+            <m:rPr>
+              <m:sty m:val="p"/>
+            </m:rPr>
+            <m:t>≤</m:t>
+          </m:r>
+          <m:f>
+            <m:fPr>
+              <m:type m:val="bar"/>
+            </m:fPr>
+            <m:num>
+              <m:sSub>
+                <m:e>
+                  <m:r>
+                    <m:t>m</m:t>
+                  </m:r>
+                </m:e>
+                <m:sub>
+                  <m:r>
+                    <m:t>0</m:t>
+                  </m:r>
+                </m:sub>
+              </m:sSub>
+              <m:r>
+                <m:t>α</m:t>
+              </m:r>
+            </m:num>
+            <m:den>
+              <m:r>
+                <m:t>m</m:t>
+              </m:r>
+            </m:den>
+          </m:f>
+          <m:r>
+            <m:rPr>
+              <m:sty m:val="p"/>
+            </m:rPr>
+            <m:t>.</m:t>
+          </m:r>
+        </m:oMath>
+      </m:oMathPara>
+    </w:p>
+    <w:bookmarkEnd w:id="65"/>
+    <w:p>
+      <w:pPr>
+        <w:pStyle w:val="FirstParagraph"/>
+      </w:pPr>
+      <w:r>
+        <w:rPr>
+          <w:i/>
+          <w:iCs/>
+        </w:rPr>
+        <w:t xml:space="preserve">Proof</w:t>
+      </w:r>
+      <w:r>
+        <w:t xml:space="preserve">. </w:t>
+      </w:r>
+      <w:r>
+        <w:t xml:space="preserve">This is the solution to</w:t>
+      </w:r>
+      <w:r>
+        <w:t xml:space="preserve"> </w:t>
+      </w:r>
+      <w:hyperlink w:anchor="exr-bonferroni-fwer">
+        <w:r>
+          <w:rPr>
+            <w:rStyle w:val="Hyperlink"/>
+          </w:rPr>
+          <w:t xml:space="preserve">Exercise 3</w:t>
+        </w:r>
+      </w:hyperlink>
+      <w:r>
+        <w:t xml:space="preserve">, worked in</w:t>
+      </w:r>
+      <w:r>
+        <w:t xml:space="preserve"> </w:t>
+      </w:r>
+      <w:hyperlink w:anchor="sol-bonferroni-fwer">
+        <w:r>
+          <w:rPr>
+            <w:rStyle w:val="Hyperlink"/>
+          </w:rPr>
+          <w:t xml:space="preserve">Solution 3</w:t>
+        </w:r>
+      </w:hyperlink>
+      <w:r>
+        <w:t xml:space="preserve">.</w:t>
+      </w:r>
+      <w:r>
+        <w:t xml:space="preserve"> </w:t>
+      </w:r>
+      <w:r>
+        <w:t xml:space="preserve">It uses the union bound (</w:t>
+      </w:r>
+      <w:hyperlink w:anchor="thm-union-bound">
+        <w:r>
+          <w:rPr>
+            <w:rStyle w:val="Hyperlink"/>
+          </w:rPr>
+          <w:t xml:space="preserve">Theorem 2</w:t>
+        </w:r>
+      </w:hyperlink>
+      <w:r>
+        <w:t xml:space="preserve">).</w:t>
+      </w:r>
+    </w:p>
+    <w:bookmarkStart w:id="66" w:name="thm-bonferroni-fwer"/>
+    <w:p>
+      <w:pPr>
+        <w:pStyle w:val="BodyText"/>
       </w:pPr>
       <w:r>
         <w:rPr>
@@ -14195,7 +15199,7 @@
         <w:t xml:space="preserve">whatever the dependence between the p-values.</w:t>
       </w:r>
     </w:p>
-    <w:bookmarkEnd w:id="63"/>
+    <w:bookmarkEnd w:id="66"/>
     <w:p>
       <w:pPr>
         <w:pStyle w:val="BodyText"/>
@@ -14230,12 +15234,12 @@
       <w:r>
         <w:t xml:space="preserve"> </w:t>
       </w:r>
-      <w:hyperlink w:anchor="sol-bonferroni-fwer">
+      <w:hyperlink w:anchor="lem-bonferroni-false-positive-prob">
         <w:r>
           <w:rPr>
             <w:rStyle w:val="Hyperlink"/>
           </w:rPr>
-          <w:t xml:space="preserve">Solution 3</w:t>
+          <w:t xml:space="preserve">Lemma 3</w:t>
         </w:r>
       </w:hyperlink>
       <w:r>
@@ -14478,7 +15482,7 @@
         <w:t xml:space="preserve">so it needs no assumption about how the p-values depend on each other.</w:t>
       </w:r>
     </w:p>
-    <w:bookmarkStart w:id="64" w:name="exm-bonferroni-fwer"/>
+    <w:bookmarkStart w:id="67" w:name="exm-bonferroni-fwer"/>
     <w:p>
       <w:pPr>
         <w:pStyle w:val="BodyText"/>
@@ -14794,9 +15798,9 @@
         <w:t xml:space="preserve">against 85% for unadjusted testing.</w:t>
       </w:r>
     </w:p>
-    <w:bookmarkEnd w:id="64"/>
-    <w:bookmarkEnd w:id="65"/>
-    <w:bookmarkStart w:id="74" w:name="sec-holm"/>
+    <w:bookmarkEnd w:id="67"/>
+    <w:bookmarkEnd w:id="68"/>
+    <w:bookmarkStart w:id="78" w:name="sec-holm"/>
     <w:p>
       <w:pPr>
         <w:pStyle w:val="Heading3"/>
@@ -14805,7 +15809,7 @@
         <w:t xml:space="preserve">4.2 Holm’s step-down procedure</w:t>
       </w:r>
     </w:p>
-    <w:bookmarkStart w:id="68" w:name="def-holm"/>
+    <w:bookmarkStart w:id="71" w:name="def-holm"/>
     <w:p>
       <w:pPr>
         <w:pStyle w:val="FirstParagraph"/>
@@ -15480,18 +16484,18 @@
                 <wp:inline>
                   <wp:extent cx="152400" cy="152400"/>
                   <wp:effectExtent b="0" l="0" r="0" t="0"/>
-                  <wp:docPr descr="" title="" id="66" name="Picture"/>
+                  <wp:docPr descr="" title="" id="69" name="Picture"/>
                   <a:graphic>
                     <a:graphicData uri="http://schemas.openxmlformats.org/drawingml/2006/picture">
                       <pic:pic>
                         <pic:nvPicPr>
-                          <pic:cNvPr descr="/opt/quarto/share/formats/docx/note.png" id="67" name="Picture"/>
+                          <pic:cNvPr descr="/opt/quarto/share/formats/docx/note.png" id="70" name="Picture"/>
                           <pic:cNvPicPr>
                             <a:picLocks noChangeArrowheads="1" noChangeAspect="1"/>
                           </pic:cNvPicPr>
                         </pic:nvPicPr>
                         <pic:blipFill>
-                          <a:blip r:embed="rId38"/>
+                          <a:blip r:embed="rId39"/>
                           <a:stretch>
                             <a:fillRect/>
                           </a:stretch>
@@ -15564,8 +16568,8 @@
         </w:tc>
       </w:tr>
     </w:tbl>
-    <w:bookmarkEnd w:id="68"/>
-    <w:bookmarkStart w:id="69" w:name="exm-holm"/>
+    <w:bookmarkEnd w:id="71"/>
+    <w:bookmarkStart w:id="72" w:name="exm-holm"/>
     <w:p>
       <w:pPr>
         <w:pStyle w:val="BodyText"/>
@@ -17666,8 +18670,8 @@
         <w:t xml:space="preserve">they reject 62 and 62.</w:t>
       </w:r>
     </w:p>
-    <w:bookmarkEnd w:id="69"/>
-    <w:bookmarkStart w:id="70" w:name="exr-holm-threshold"/>
+    <w:bookmarkEnd w:id="72"/>
+    <w:bookmarkStart w:id="73" w:name="exr-holm-threshold"/>
     <w:p>
       <w:pPr>
         <w:pStyle w:val="BodyText"/>
@@ -17928,8 +18932,8 @@
         </m:oMath>
       </m:oMathPara>
     </w:p>
-    <w:bookmarkEnd w:id="70"/>
-    <w:bookmarkStart w:id="71" w:name="sol-holm-threshold"/>
+    <w:bookmarkEnd w:id="73"/>
+    <w:bookmarkStart w:id="74" w:name="sol-holm-threshold"/>
     <w:p>
       <w:pPr>
         <w:pStyle w:val="FirstParagraph"/>
@@ -18921,8 +19925,316 @@
         <w:t xml:space="preserve">, the claim follows.</w:t>
       </w:r>
     </w:p>
-    <w:bookmarkEnd w:id="71"/>
-    <w:bookmarkStart w:id="72" w:name="thm-holm-fwer"/>
+    <w:bookmarkEnd w:id="74"/>
+    <w:bookmarkStart w:id="75" w:name="lem-holm-threshold"/>
+    <w:p>
+      <w:pPr>
+        <w:pStyle w:val="BodyText"/>
+      </w:pPr>
+      <w:r>
+        <w:rPr>
+          <w:b/>
+          <w:bCs/>
+        </w:rPr>
+        <w:t xml:space="preserve">Lemma 4 (A rejected true null hypothesis has a small p-value under Holm’s procedure)</w:t>
+      </w:r>
+      <w:r>
+        <w:t xml:space="preserve"> </w:t>
+      </w:r>
+      <w:r>
+        <w:t xml:space="preserve">Let</w:t>
+      </w:r>
+      <w:r>
+        <w:t xml:space="preserve"> </w:t>
+      </w:r>
+      <m:oMath>
+        <m:r>
+          <m:t>m</m:t>
+        </m:r>
+      </m:oMath>
+      <w:r>
+        <w:t xml:space="preserve"> </w:t>
+      </w:r>
+      <w:r>
+        <w:t xml:space="preserve">null hypotheses have p-values, and let</w:t>
+      </w:r>
+      <w:r>
+        <w:t xml:space="preserve"> </w:t>
+      </w:r>
+      <m:oMath>
+        <m:sSub>
+          <m:e>
+            <m:r>
+              <m:rPr>
+                <m:scr m:val="script"/>
+                <m:sty m:val="p"/>
+              </m:rPr>
+              <m:t>I</m:t>
+            </m:r>
+          </m:e>
+          <m:sub>
+            <m:r>
+              <m:t>0</m:t>
+            </m:r>
+          </m:sub>
+        </m:sSub>
+      </m:oMath>
+      <w:r>
+        <w:t xml:space="preserve"> </w:t>
+      </w:r>
+      <w:r>
+        <w:t xml:space="preserve">be the set of</w:t>
+      </w:r>
+      <w:r>
+        <w:t xml:space="preserve"> </w:t>
+      </w:r>
+      <m:oMath>
+        <m:sSub>
+          <m:e>
+            <m:r>
+              <m:t>m</m:t>
+            </m:r>
+          </m:e>
+          <m:sub>
+            <m:r>
+              <m:t>0</m:t>
+            </m:r>
+          </m:sub>
+        </m:sSub>
+        <m:r>
+          <m:rPr>
+            <m:sty m:val="p"/>
+          </m:rPr>
+          <m:t>≥</m:t>
+        </m:r>
+        <m:r>
+          <m:t>1</m:t>
+        </m:r>
+      </m:oMath>
+      <w:r>
+        <w:t xml:space="preserve"> </w:t>
+      </w:r>
+      <w:r>
+        <w:t xml:space="preserve">indices of the true null hypotheses.</w:t>
+      </w:r>
+      <w:r>
+        <w:t xml:space="preserve"> </w:t>
+      </w:r>
+      <w:r>
+        <w:t xml:space="preserve">If</w:t>
+      </w:r>
+      <w:r>
+        <w:t xml:space="preserve"> </w:t>
+      </w:r>
+      <w:hyperlink w:anchor="def-holm">
+        <w:r>
+          <w:rPr>
+            <w:rStyle w:val="Hyperlink"/>
+          </w:rPr>
+          <w:t xml:space="preserve">Holm’s procedure</w:t>
+        </w:r>
+      </w:hyperlink>
+      <w:r>
+        <w:t xml:space="preserve"> </w:t>
+      </w:r>
+      <w:r>
+        <w:t xml:space="preserve">at level</w:t>
+      </w:r>
+      <w:r>
+        <w:t xml:space="preserve"> </w:t>
+      </w:r>
+      <m:oMath>
+        <m:r>
+          <m:t>α</m:t>
+        </m:r>
+      </m:oMath>
+      <w:r>
+        <w:t xml:space="preserve"> </w:t>
+      </w:r>
+      <w:r>
+        <w:t xml:space="preserve">rejects at least one true null hypothesis,</w:t>
+      </w:r>
+      <w:r>
+        <w:t xml:space="preserve"> </w:t>
+      </w:r>
+      <w:r>
+        <w:t xml:space="preserve">then the smallest p-value among the true null hypotheses is at most</w:t>
+      </w:r>
+      <w:r>
+        <w:t xml:space="preserve"> </w:t>
+      </w:r>
+      <m:oMath>
+        <m:r>
+          <m:t>α</m:t>
+        </m:r>
+        <m:r>
+          <m:rPr>
+            <m:sty m:val="p"/>
+          </m:rPr>
+          <m:t>/</m:t>
+        </m:r>
+        <m:sSub>
+          <m:e>
+            <m:r>
+              <m:t>m</m:t>
+            </m:r>
+          </m:e>
+          <m:sub>
+            <m:r>
+              <m:t>0</m:t>
+            </m:r>
+          </m:sub>
+        </m:sSub>
+      </m:oMath>
+      <w:r>
+        <w:t xml:space="preserve">:</w:t>
+      </w:r>
+    </w:p>
+    <w:p>
+      <w:pPr>
+        <w:pStyle w:val="BodyText"/>
+      </w:pPr>
+      <m:oMathPara>
+        <m:oMathParaPr>
+          <m:jc m:val="center"/>
+        </m:oMathParaPr>
+        <m:oMath>
+          <m:limLow>
+            <m:e>
+              <m:r>
+                <m:rPr>
+                  <m:sty m:val="p"/>
+                </m:rPr>
+                <m:t>min</m:t>
+              </m:r>
+            </m:e>
+            <m:lim>
+              <m:r>
+                <m:t>j</m:t>
+              </m:r>
+              <m:r>
+                <m:rPr>
+                  <m:sty m:val="p"/>
+                </m:rPr>
+                <m:t>∈</m:t>
+              </m:r>
+              <m:sSub>
+                <m:e>
+                  <m:r>
+                    <m:rPr>
+                      <m:scr m:val="script"/>
+                      <m:sty m:val="p"/>
+                    </m:rPr>
+                    <m:t>I</m:t>
+                  </m:r>
+                </m:e>
+                <m:sub>
+                  <m:r>
+                    <m:t>0</m:t>
+                  </m:r>
+                </m:sub>
+              </m:sSub>
+            </m:lim>
+          </m:limLow>
+          <m:sSub>
+            <m:e>
+              <m:r>
+                <m:t>p</m:t>
+              </m:r>
+            </m:e>
+            <m:sub>
+              <m:r>
+                <m:t>j</m:t>
+              </m:r>
+            </m:sub>
+          </m:sSub>
+          <m:r>
+            <m:rPr>
+              <m:sty m:val="p"/>
+            </m:rPr>
+            <m:t>≤</m:t>
+          </m:r>
+          <m:f>
+            <m:fPr>
+              <m:type m:val="bar"/>
+            </m:fPr>
+            <m:num>
+              <m:r>
+                <m:t>α</m:t>
+              </m:r>
+            </m:num>
+            <m:den>
+              <m:sSub>
+                <m:e>
+                  <m:r>
+                    <m:t>m</m:t>
+                  </m:r>
+                </m:e>
+                <m:sub>
+                  <m:r>
+                    <m:t>0</m:t>
+                  </m:r>
+                </m:sub>
+              </m:sSub>
+            </m:den>
+          </m:f>
+          <m:r>
+            <m:rPr>
+              <m:sty m:val="p"/>
+            </m:rPr>
+            <m:t>.</m:t>
+          </m:r>
+        </m:oMath>
+      </m:oMathPara>
+    </w:p>
+    <w:bookmarkEnd w:id="75"/>
+    <w:p>
+      <w:pPr>
+        <w:pStyle w:val="FirstParagraph"/>
+      </w:pPr>
+      <w:r>
+        <w:rPr>
+          <w:i/>
+          <w:iCs/>
+        </w:rPr>
+        <w:t xml:space="preserve">Proof</w:t>
+      </w:r>
+      <w:r>
+        <w:t xml:space="preserve">. </w:t>
+      </w:r>
+      <w:r>
+        <w:t xml:space="preserve">This is the solution to</w:t>
+      </w:r>
+      <w:r>
+        <w:t xml:space="preserve"> </w:t>
+      </w:r>
+      <w:hyperlink w:anchor="exr-holm-threshold">
+        <w:r>
+          <w:rPr>
+            <w:rStyle w:val="Hyperlink"/>
+          </w:rPr>
+          <w:t xml:space="preserve">Exercise 4</w:t>
+        </w:r>
+      </w:hyperlink>
+      <w:r>
+        <w:t xml:space="preserve">, worked in</w:t>
+      </w:r>
+      <w:r>
+        <w:t xml:space="preserve"> </w:t>
+      </w:r>
+      <w:hyperlink w:anchor="sol-holm-threshold">
+        <w:r>
+          <w:rPr>
+            <w:rStyle w:val="Hyperlink"/>
+          </w:rPr>
+          <w:t xml:space="preserve">Solution 4</w:t>
+        </w:r>
+      </w:hyperlink>
+      <w:r>
+        <w:t xml:space="preserve">.</w:t>
+      </w:r>
+    </w:p>
+    <w:bookmarkStart w:id="76" w:name="thm-holm-fwer"/>
     <w:p>
       <w:pPr>
         <w:pStyle w:val="BodyText"/>
@@ -19025,7 +20337,7 @@
         <w:t xml:space="preserve">whatever the dependence between the p-values.</w:t>
       </w:r>
     </w:p>
-    <w:bookmarkEnd w:id="72"/>
+    <w:bookmarkEnd w:id="76"/>
     <w:p>
       <w:pPr>
         <w:pStyle w:val="BodyText"/>
@@ -19189,12 +20501,12 @@
       <w:r>
         <w:t xml:space="preserve"> </w:t>
       </w:r>
-      <w:hyperlink w:anchor="sol-holm-threshold">
+      <w:hyperlink w:anchor="lem-holm-threshold">
         <w:r>
           <w:rPr>
             <w:rStyle w:val="Hyperlink"/>
           </w:rPr>
-          <w:t xml:space="preserve">Solution 4</w:t>
+          <w:t xml:space="preserve">Lemma 4</w:t>
         </w:r>
       </w:hyperlink>
       <w:r>
@@ -20143,7 +21455,7 @@
         <w:t xml:space="preserve">As for the Bonferroni correction, no assumption about dependence is needed.</w:t>
       </w:r>
     </w:p>
-    <w:bookmarkStart w:id="73" w:name="exm-holm-fwer"/>
+    <w:bookmarkStart w:id="77" w:name="exm-holm-fwer"/>
     <w:p>
       <w:pPr>
         <w:pStyle w:val="BodyText"/>
@@ -20386,10 +21698,10 @@
         <w:t xml:space="preserve">Holm’s procedure can only reject more, but here the extra rejections are rare.</w:t>
       </w:r>
     </w:p>
-    <w:bookmarkEnd w:id="73"/>
-    <w:bookmarkEnd w:id="74"/>
-    <w:bookmarkEnd w:id="75"/>
-    <w:bookmarkStart w:id="87" w:name="sec-fdr-control"/>
+    <w:bookmarkEnd w:id="77"/>
+    <w:bookmarkEnd w:id="78"/>
+    <w:bookmarkEnd w:id="79"/>
+    <w:bookmarkStart w:id="91" w:name="sec-fdr-control"/>
     <w:p>
       <w:pPr>
         <w:pStyle w:val="Heading2"/>
@@ -20398,7 +21710,7 @@
         <w:t xml:space="preserve">5 Controlling the false discovery rate</w:t>
       </w:r>
     </w:p>
-    <w:bookmarkStart w:id="86" w:name="sec-bh"/>
+    <w:bookmarkStart w:id="90" w:name="sec-bh"/>
     <w:p>
       <w:pPr>
         <w:pStyle w:val="Heading3"/>
@@ -20407,7 +21719,7 @@
         <w:t xml:space="preserve">5.1 The Benjamini–Hochberg procedure</w:t>
       </w:r>
     </w:p>
-    <w:bookmarkStart w:id="78" w:name="def-bh"/>
+    <w:bookmarkStart w:id="82" w:name="def-bh"/>
     <w:p>
       <w:pPr>
         <w:pStyle w:val="FirstParagraph"/>
@@ -20916,18 +22228,18 @@
                 <wp:inline>
                   <wp:extent cx="152400" cy="152400"/>
                   <wp:effectExtent b="0" l="0" r="0" t="0"/>
-                  <wp:docPr descr="" title="" id="76" name="Picture"/>
+                  <wp:docPr descr="" title="" id="80" name="Picture"/>
                   <a:graphic>
                     <a:graphicData uri="http://schemas.openxmlformats.org/drawingml/2006/picture">
                       <pic:pic>
                         <pic:nvPicPr>
-                          <pic:cNvPr descr="/opt/quarto/share/formats/docx/note.png" id="77" name="Picture"/>
+                          <pic:cNvPr descr="/opt/quarto/share/formats/docx/note.png" id="81" name="Picture"/>
                           <pic:cNvPicPr>
                             <a:picLocks noChangeArrowheads="1" noChangeAspect="1"/>
                           </pic:cNvPicPr>
                         </pic:nvPicPr>
                         <pic:blipFill>
-                          <a:blip r:embed="rId38"/>
+                          <a:blip r:embed="rId39"/>
                           <a:stretch>
                             <a:fillRect/>
                           </a:stretch>
@@ -21000,8 +22312,8 @@
         </w:tc>
       </w:tr>
     </w:tbl>
-    <w:bookmarkEnd w:id="78"/>
-    <w:bookmarkStart w:id="79" w:name="rem-bh-step-up"/>
+    <w:bookmarkEnd w:id="82"/>
+    <w:bookmarkStart w:id="83" w:name="rem-bh-step-up"/>
     <w:p>
       <w:pPr>
         <w:pStyle w:val="BodyText"/>
@@ -21177,8 +22489,8 @@
         <w:t xml:space="preserve">.</w:t>
       </w:r>
     </w:p>
-    <w:bookmarkEnd w:id="79"/>
-    <w:bookmarkStart w:id="80" w:name="exm-bh"/>
+    <w:bookmarkEnd w:id="83"/>
+    <w:bookmarkStart w:id="84" w:name="exm-bh"/>
     <w:p>
       <w:pPr>
         <w:pStyle w:val="BodyText"/>
@@ -23175,8 +24487,8 @@
         <w:t xml:space="preserve">not about this particular list of 250 genes.</w:t>
       </w:r>
     </w:p>
-    <w:bookmarkEnd w:id="80"/>
-    <w:bookmarkStart w:id="83" w:name="thm-bh-fdr"/>
+    <w:bookmarkEnd w:id="84"/>
+    <w:bookmarkStart w:id="87" w:name="thm-bh-fdr"/>
     <w:p>
       <w:pPr>
         <w:pStyle w:val="BodyText"/>
@@ -23386,18 +24698,18 @@
                 <wp:inline>
                   <wp:extent cx="152400" cy="152400"/>
                   <wp:effectExtent b="0" l="0" r="0" t="0"/>
-                  <wp:docPr descr="" title="" id="81" name="Picture"/>
+                  <wp:docPr descr="" title="" id="85" name="Picture"/>
                   <a:graphic>
                     <a:graphicData uri="http://schemas.openxmlformats.org/drawingml/2006/picture">
                       <pic:pic>
                         <pic:nvPicPr>
-                          <pic:cNvPr descr="/opt/quarto/share/formats/docx/note.png" id="82" name="Picture"/>
+                          <pic:cNvPr descr="/opt/quarto/share/formats/docx/note.png" id="86" name="Picture"/>
                           <pic:cNvPicPr>
                             <a:picLocks noChangeArrowheads="1" noChangeAspect="1"/>
                           </pic:cNvPicPr>
                         </pic:nvPicPr>
                         <pic:blipFill>
-                          <a:blip r:embed="rId38"/>
+                          <a:blip r:embed="rId39"/>
                           <a:stretch>
                             <a:fillRect/>
                           </a:stretch>
@@ -23482,8 +24794,8 @@
         </w:tc>
       </w:tr>
     </w:tbl>
-    <w:bookmarkEnd w:id="83"/>
-    <w:bookmarkStart w:id="84" w:name="exm-bh-fdr"/>
+    <w:bookmarkEnd w:id="87"/>
+    <w:bookmarkStart w:id="88" w:name="exm-bh-fdr"/>
     <w:p>
       <w:pPr>
         <w:pStyle w:val="BodyText"/>
@@ -23841,8 +25153,8 @@
         <w:t xml:space="preserve">88% of the repetitions.</w:t>
       </w:r>
     </w:p>
-    <w:bookmarkEnd w:id="84"/>
-    <w:bookmarkStart w:id="85" w:name="rem-bh-dependence"/>
+    <w:bookmarkEnd w:id="88"/>
+    <w:bookmarkStart w:id="89" w:name="rem-bh-dependence"/>
     <w:p>
       <w:pPr>
         <w:pStyle w:val="BodyText"/>
@@ -24013,10 +25325,10 @@
         <w:t xml:space="preserve">discuss the procedure in practice.</w:t>
       </w:r>
     </w:p>
-    <w:bookmarkEnd w:id="85"/>
-    <w:bookmarkEnd w:id="86"/>
-    <w:bookmarkEnd w:id="87"/>
-    <w:bookmarkStart w:id="92" w:name="sec-adjusted-p-values"/>
+    <w:bookmarkEnd w:id="89"/>
+    <w:bookmarkEnd w:id="90"/>
+    <w:bookmarkEnd w:id="91"/>
+    <w:bookmarkStart w:id="96" w:name="sec-adjusted-p-values"/>
     <w:p>
       <w:pPr>
         <w:pStyle w:val="Heading2"/>
@@ -24025,7 +25337,7 @@
         <w:t xml:space="preserve">6 Adjusted p-values and q-values</w:t>
       </w:r>
     </w:p>
-    <w:bookmarkStart w:id="88" w:name="def-adjusted-p-value"/>
+    <w:bookmarkStart w:id="92" w:name="def-adjusted-p-value"/>
     <w:p>
       <w:pPr>
         <w:pStyle w:val="FirstParagraph"/>
@@ -24338,8 +25650,8 @@
         </m:oMath>
       </m:oMathPara>
     </w:p>
-    <w:bookmarkEnd w:id="88"/>
-    <w:bookmarkStart w:id="89" w:name="rem-adjusted-p-value-levels"/>
+    <w:bookmarkEnd w:id="92"/>
+    <w:bookmarkStart w:id="93" w:name="rem-adjusted-p-value-levels"/>
     <w:p>
       <w:pPr>
         <w:pStyle w:val="FirstParagraph"/>
@@ -24420,8 +25732,8 @@
         <w:t xml:space="preserve">so a reader can apply any level to a list of adjusted p-values without redoing the procedure.</w:t>
       </w:r>
     </w:p>
-    <w:bookmarkEnd w:id="89"/>
-    <w:bookmarkStart w:id="90" w:name="exm-adjusted-p-value"/>
+    <w:bookmarkEnd w:id="93"/>
+    <w:bookmarkStart w:id="94" w:name="exm-adjusted-p-value"/>
     <w:p>
       <w:pPr>
         <w:pStyle w:val="BodyText"/>
@@ -26600,8 +27912,8 @@
         <w:t xml:space="preserve">it is not a proof that they agree for every data set.</w:t>
       </w:r>
     </w:p>
-    <w:bookmarkEnd w:id="90"/>
-    <w:bookmarkStart w:id="91" w:name="rem-q-value"/>
+    <w:bookmarkEnd w:id="94"/>
+    <w:bookmarkStart w:id="95" w:name="rem-q-value"/>
     <w:p>
       <w:pPr>
         <w:pStyle w:val="BodyText"/>
@@ -26778,9 +28090,9 @@
         <w:t xml:space="preserve">, so Storey’s q-values are smaller, and reject more, when many null hypotheses are false.</w:t>
       </w:r>
     </w:p>
-    <w:bookmarkEnd w:id="91"/>
-    <w:bookmarkEnd w:id="92"/>
-    <w:bookmarkStart w:id="95" w:name="sec-procedure-comparison"/>
+    <w:bookmarkEnd w:id="95"/>
+    <w:bookmarkEnd w:id="96"/>
+    <w:bookmarkStart w:id="99" w:name="sec-procedure-comparison"/>
     <w:p>
       <w:pPr>
         <w:pStyle w:val="Heading2"/>
@@ -26789,7 +28101,7 @@
         <w:t xml:space="preserve">7 Comparing the procedures</w:t>
       </w:r>
     </w:p>
-    <w:bookmarkStart w:id="93" w:name="exm-procedure-comparison"/>
+    <w:bookmarkStart w:id="97" w:name="exm-procedure-comparison"/>
     <w:p>
       <w:pPr>
         <w:pStyle w:val="FirstParagraph"/>
@@ -27328,8 +28640,8 @@
         <w:t xml:space="preserve">Its FWER is far above 0.05, which BH does not promise to control.</w:t>
       </w:r>
     </w:p>
-    <w:bookmarkEnd w:id="93"/>
-    <w:bookmarkStart w:id="94" w:name="rem-choosing-error-rate"/>
+    <w:bookmarkEnd w:id="97"/>
+    <w:bookmarkStart w:id="98" w:name="rem-choosing-error-rate"/>
     <w:p>
       <w:pPr>
         <w:pStyle w:val="BodyText"/>
@@ -27378,9 +28690,9 @@
         <w:t xml:space="preserve">The choice should be made before looking at the data.</w:t>
       </w:r>
     </w:p>
-    <w:bookmarkEnd w:id="94"/>
-    <w:bookmarkEnd w:id="95"/>
-    <w:bookmarkStart w:id="111" w:name="sec-multiple-testing-reading"/>
+    <w:bookmarkEnd w:id="98"/>
+    <w:bookmarkEnd w:id="99"/>
+    <w:bookmarkStart w:id="115" w:name="sec-multiple-testing-reading"/>
     <w:p>
       <w:pPr>
         <w:pStyle w:val="Heading2"/>
@@ -27451,7 +28763,7 @@
       <w:r>
         <w:t xml:space="preserve"> </w:t>
       </w:r>
-      <w:hyperlink r:id="rId96">
+      <w:hyperlink r:id="rId100">
         <w:r>
           <w:rPr>
             <w:rStyle w:val="Hyperlink"/>
@@ -27501,8 +28813,8 @@
         <w:t xml:space="preserve">without a distributional model for the test statistic.</w:t>
       </w:r>
     </w:p>
-    <w:bookmarkStart w:id="110" w:name="refs"/>
-    <w:bookmarkStart w:id="98" w:name="ref-benjamini1995controlling"/>
+    <w:bookmarkStart w:id="114" w:name="refs"/>
+    <w:bookmarkStart w:id="102" w:name="ref-benjamini1995controlling"/>
     <w:p>
       <w:pPr>
         <w:pStyle w:val="Bibliography"/>
@@ -27535,7 +28847,7 @@
       <w:r>
         <w:t xml:space="preserve"> </w:t>
       </w:r>
-      <w:hyperlink r:id="rId97">
+      <w:hyperlink r:id="rId101">
         <w:r>
           <w:rPr>
             <w:rStyle w:val="Hyperlink"/>
@@ -27547,8 +28859,8 @@
         <w:t xml:space="preserve">.</w:t>
       </w:r>
     </w:p>
-    <w:bookmarkEnd w:id="98"/>
-    <w:bookmarkStart w:id="100" w:name="ref-benjamini2001control"/>
+    <w:bookmarkEnd w:id="102"/>
+    <w:bookmarkStart w:id="104" w:name="ref-benjamini2001control"/>
     <w:p>
       <w:pPr>
         <w:pStyle w:val="Bibliography"/>
@@ -27581,7 +28893,7 @@
       <w:r>
         <w:t xml:space="preserve"> </w:t>
       </w:r>
-      <w:hyperlink r:id="rId99">
+      <w:hyperlink r:id="rId103">
         <w:r>
           <w:rPr>
             <w:rStyle w:val="Hyperlink"/>
@@ -27593,8 +28905,8 @@
         <w:t xml:space="preserve">.</w:t>
       </w:r>
     </w:p>
-    <w:bookmarkEnd w:id="100"/>
-    <w:bookmarkStart w:id="102" w:name="ref-efron2016computer"/>
+    <w:bookmarkEnd w:id="104"/>
+    <w:bookmarkStart w:id="106" w:name="ref-efron2016computer"/>
     <w:p>
       <w:pPr>
         <w:pStyle w:val="Bibliography"/>
@@ -27618,7 +28930,7 @@
       <w:r>
         <w:t xml:space="preserve"> </w:t>
       </w:r>
-      <w:hyperlink r:id="rId101">
+      <w:hyperlink r:id="rId105">
         <w:r>
           <w:rPr>
             <w:rStyle w:val="Hyperlink"/>
@@ -27630,8 +28942,8 @@
         <w:t xml:space="preserve">.</w:t>
       </w:r>
     </w:p>
-    <w:bookmarkEnd w:id="102"/>
-    <w:bookmarkStart w:id="103" w:name="ref-holm1979simple"/>
+    <w:bookmarkEnd w:id="106"/>
+    <w:bookmarkStart w:id="107" w:name="ref-holm1979simple"/>
     <w:p>
       <w:pPr>
         <w:pStyle w:val="Bibliography"/>
@@ -27662,8 +28974,8 @@
         <w:t xml:space="preserve">6 (2): 65–70.</w:t>
       </w:r>
     </w:p>
-    <w:bookmarkEnd w:id="103"/>
-    <w:bookmarkStart w:id="105" w:name="ref-james2021islr2e"/>
+    <w:bookmarkEnd w:id="107"/>
+    <w:bookmarkStart w:id="109" w:name="ref-james2021islr2e"/>
     <w:p>
       <w:pPr>
         <w:pStyle w:val="Bibliography"/>
@@ -27701,7 +29013,7 @@
       <w:r>
         <w:t xml:space="preserve"> </w:t>
       </w:r>
-      <w:hyperlink r:id="rId104">
+      <w:hyperlink r:id="rId108">
         <w:r>
           <w:rPr>
             <w:rStyle w:val="Hyperlink"/>
@@ -27713,8 +29025,8 @@
         <w:t xml:space="preserve">.</w:t>
       </w:r>
     </w:p>
-    <w:bookmarkEnd w:id="105"/>
-    <w:bookmarkStart w:id="107" w:name="ref-khan2001classification"/>
+    <w:bookmarkEnd w:id="109"/>
+    <w:bookmarkStart w:id="111" w:name="ref-khan2001classification"/>
     <w:p>
       <w:pPr>
         <w:pStyle w:val="Bibliography"/>
@@ -27747,7 +29059,7 @@
       <w:r>
         <w:t xml:space="preserve"> </w:t>
       </w:r>
-      <w:hyperlink r:id="rId106">
+      <w:hyperlink r:id="rId110">
         <w:r>
           <w:rPr>
             <w:rStyle w:val="Hyperlink"/>
@@ -27759,8 +29071,8 @@
         <w:t xml:space="preserve">.</w:t>
       </w:r>
     </w:p>
-    <w:bookmarkEnd w:id="107"/>
-    <w:bookmarkStart w:id="109" w:name="ref-storey2002direct"/>
+    <w:bookmarkEnd w:id="111"/>
+    <w:bookmarkStart w:id="113" w:name="ref-storey2002direct"/>
     <w:p>
       <w:pPr>
         <w:pStyle w:val="Bibliography"/>
@@ -27793,7 +29105,7 @@
       <w:r>
         <w:t xml:space="preserve"> </w:t>
       </w:r>
-      <w:hyperlink r:id="rId108">
+      <w:hyperlink r:id="rId112">
         <w:r>
           <w:rPr>
             <w:rStyle w:val="Hyperlink"/>
@@ -27805,9 +29117,9 @@
         <w:t xml:space="preserve">.</w:t>
       </w:r>
     </w:p>
-    <w:bookmarkEnd w:id="109"/>
-    <w:bookmarkEnd w:id="110"/>
-    <w:bookmarkEnd w:id="111"/>
+    <w:bookmarkEnd w:id="113"/>
+    <w:bookmarkEnd w:id="114"/>
+    <w:bookmarkEnd w:id="115"/>
     <w:sectPr>
       <w:footnotePr>
         <w:numRestart w:val="eachSect"/>

</xml_diff>

<commit_message>
Deploying to gh-pages from @ Morrison-Lab/sds@ec482a54e108f539a413765e2a4c7c219027f3c2 🚀
</commit_message>
<xml_diff>
--- a/multiple-testing-handout.docx
+++ b/multiple-testing-handout.docx
@@ -15,7 +15,7 @@
         <w:pStyle w:val="Date"/>
       </w:pPr>
       <w:r>
-        <w:t xml:space="preserve">Last modified: 2026-10-16 03:46:21 (PDT)</w:t>
+        <w:t xml:space="preserve">Last modified: 2026-10-16 04:05:26 (PDT)</w:t>
       </w:r>
     </w:p>
     <w:p>
@@ -28383,7 +28383,7 @@
     </w:p>
     <w:bookmarkEnd w:id="91"/>
     <w:bookmarkEnd w:id="92"/>
-    <w:bookmarkStart w:id="94" w:name="sec-multiple-testing-reading"/>
+    <w:bookmarkStart w:id="95" w:name="sec-multiple-testing-reading"/>
     <w:p>
       <w:pPr>
         <w:pStyle w:val="Heading2"/>
@@ -28478,6 +28478,49 @@
         </w:numPr>
       </w:pPr>
       <w:r>
+        <w:t xml:space="preserve">Will Fithian’s</w:t>
+      </w:r>
+      <w:r>
+        <w:t xml:space="preserve"> </w:t>
+      </w:r>
+      <w:hyperlink r:id="rId94">
+        <w:r>
+          <w:rPr>
+            <w:rStyle w:val="Hyperlink"/>
+          </w:rPr>
+          <w:t xml:space="preserve">Stat 212A,</w:t>
+        </w:r>
+        <w:r>
+          <w:rPr>
+            <w:rStyle w:val="Hyperlink"/>
+          </w:rPr>
+          <w:t xml:space="preserve"> </w:t>
+        </w:r>
+        <w:r>
+          <w:rPr>
+            <w:rStyle w:val="Hyperlink"/>
+            <w:i/>
+            <w:iCs/>
+          </w:rPr>
+          <w:t xml:space="preserve">Topics in Selective Inference</w:t>
+        </w:r>
+      </w:hyperlink>
+      <w:r>
+        <w:t xml:space="preserve"> </w:t>
+      </w:r>
+      <w:r>
+        <w:t xml:space="preserve">(UC Berkeley, Fall 2015) has a syllabus, references and homework with solutions on inference after selection, including multiple testing.</w:t>
+      </w:r>
+    </w:p>
+    <w:p>
+      <w:pPr>
+        <w:pStyle w:val="Compact"/>
+        <w:numPr>
+          <w:ilvl w:val="0"/>
+          <w:numId w:val="1005"/>
+        </w:numPr>
+      </w:pPr>
+      <w:r>
         <w:t xml:space="preserve">The</w:t>
       </w:r>
       <w:r>
@@ -28504,8 +28547,8 @@
         <w:t xml:space="preserve">without a distributional model for the test statistic.</w:t>
       </w:r>
     </w:p>
-    <w:bookmarkEnd w:id="94"/>
-    <w:bookmarkStart w:id="112" w:name="references"/>
+    <w:bookmarkEnd w:id="95"/>
+    <w:bookmarkStart w:id="113" w:name="references"/>
     <w:p>
       <w:pPr>
         <w:pStyle w:val="Heading2"/>
@@ -28514,8 +28557,8 @@
         <w:t xml:space="preserve">References</w:t>
       </w:r>
     </w:p>
-    <w:bookmarkStart w:id="111" w:name="refs"/>
-    <w:bookmarkStart w:id="96" w:name="ref-benjamini1995controlling"/>
+    <w:bookmarkStart w:id="112" w:name="refs"/>
+    <w:bookmarkStart w:id="97" w:name="ref-benjamini1995controlling"/>
     <w:p>
       <w:pPr>
         <w:pStyle w:val="Bibliography"/>
@@ -28548,7 +28591,7 @@
       <w:r>
         <w:t xml:space="preserve"> </w:t>
       </w:r>
-      <w:hyperlink r:id="rId95">
+      <w:hyperlink r:id="rId96">
         <w:r>
           <w:rPr>
             <w:rStyle w:val="Hyperlink"/>
@@ -28560,8 +28603,8 @@
         <w:t xml:space="preserve">.</w:t>
       </w:r>
     </w:p>
-    <w:bookmarkEnd w:id="96"/>
-    <w:bookmarkStart w:id="98" w:name="ref-benjamini2001control"/>
+    <w:bookmarkEnd w:id="97"/>
+    <w:bookmarkStart w:id="99" w:name="ref-benjamini2001control"/>
     <w:p>
       <w:pPr>
         <w:pStyle w:val="Bibliography"/>
@@ -28594,7 +28637,7 @@
       <w:r>
         <w:t xml:space="preserve"> </w:t>
       </w:r>
-      <w:hyperlink r:id="rId97">
+      <w:hyperlink r:id="rId98">
         <w:r>
           <w:rPr>
             <w:rStyle w:val="Hyperlink"/>
@@ -28606,8 +28649,8 @@
         <w:t xml:space="preserve">.</w:t>
       </w:r>
     </w:p>
-    <w:bookmarkEnd w:id="98"/>
-    <w:bookmarkStart w:id="100" w:name="ref-CaseBerg01"/>
+    <w:bookmarkEnd w:id="99"/>
+    <w:bookmarkStart w:id="101" w:name="ref-CaseBerg01"/>
     <w:p>
       <w:pPr>
         <w:pStyle w:val="Bibliography"/>
@@ -28631,7 +28674,7 @@
       <w:r>
         <w:t xml:space="preserve"> </w:t>
       </w:r>
-      <w:hyperlink r:id="rId99">
+      <w:hyperlink r:id="rId100">
         <w:r>
           <w:rPr>
             <w:rStyle w:val="Hyperlink"/>
@@ -28643,8 +28686,8 @@
         <w:t xml:space="preserve">.</w:t>
       </w:r>
     </w:p>
-    <w:bookmarkEnd w:id="100"/>
-    <w:bookmarkStart w:id="102" w:name="ref-efron2016computer"/>
+    <w:bookmarkEnd w:id="101"/>
+    <w:bookmarkStart w:id="103" w:name="ref-efron2016computer"/>
     <w:p>
       <w:pPr>
         <w:pStyle w:val="Bibliography"/>
@@ -28668,7 +28711,7 @@
       <w:r>
         <w:t xml:space="preserve"> </w:t>
       </w:r>
-      <w:hyperlink r:id="rId101">
+      <w:hyperlink r:id="rId102">
         <w:r>
           <w:rPr>
             <w:rStyle w:val="Hyperlink"/>
@@ -28680,8 +28723,8 @@
         <w:t xml:space="preserve">.</w:t>
       </w:r>
     </w:p>
-    <w:bookmarkEnd w:id="102"/>
-    <w:bookmarkStart w:id="103" w:name="ref-holm1979simple"/>
+    <w:bookmarkEnd w:id="103"/>
+    <w:bookmarkStart w:id="104" w:name="ref-holm1979simple"/>
     <w:p>
       <w:pPr>
         <w:pStyle w:val="Bibliography"/>
@@ -28712,8 +28755,8 @@
         <w:t xml:space="preserve">6 (2): 65–70.</w:t>
       </w:r>
     </w:p>
-    <w:bookmarkEnd w:id="103"/>
-    <w:bookmarkStart w:id="105" w:name="ref-james2021islr2e"/>
+    <w:bookmarkEnd w:id="104"/>
+    <w:bookmarkStart w:id="106" w:name="ref-james2021islr2e"/>
     <w:p>
       <w:pPr>
         <w:pStyle w:val="Bibliography"/>
@@ -28751,7 +28794,7 @@
       <w:r>
         <w:t xml:space="preserve"> </w:t>
       </w:r>
-      <w:hyperlink r:id="rId104">
+      <w:hyperlink r:id="rId105">
         <w:r>
           <w:rPr>
             <w:rStyle w:val="Hyperlink"/>
@@ -28763,8 +28806,8 @@
         <w:t xml:space="preserve">.</w:t>
       </w:r>
     </w:p>
-    <w:bookmarkEnd w:id="105"/>
-    <w:bookmarkStart w:id="107" w:name="ref-khan2001classification"/>
+    <w:bookmarkEnd w:id="106"/>
+    <w:bookmarkStart w:id="108" w:name="ref-khan2001classification"/>
     <w:p>
       <w:pPr>
         <w:pStyle w:val="Bibliography"/>
@@ -28797,7 +28840,7 @@
       <w:r>
         <w:t xml:space="preserve"> </w:t>
       </w:r>
-      <w:hyperlink r:id="rId106">
+      <w:hyperlink r:id="rId107">
         <w:r>
           <w:rPr>
             <w:rStyle w:val="Hyperlink"/>
@@ -28809,8 +28852,8 @@
         <w:t xml:space="preserve">.</w:t>
       </w:r>
     </w:p>
-    <w:bookmarkEnd w:id="107"/>
-    <w:bookmarkStart w:id="108" w:name="ref-rice2007mathematical"/>
+    <w:bookmarkEnd w:id="108"/>
+    <w:bookmarkStart w:id="109" w:name="ref-rice2007mathematical"/>
     <w:p>
       <w:pPr>
         <w:pStyle w:val="Bibliography"/>
@@ -28832,8 +28875,8 @@
         <w:t xml:space="preserve">. 3rd ed. Cengage Learning.</w:t>
       </w:r>
     </w:p>
-    <w:bookmarkEnd w:id="108"/>
-    <w:bookmarkStart w:id="110" w:name="ref-storey2002direct"/>
+    <w:bookmarkEnd w:id="109"/>
+    <w:bookmarkStart w:id="111" w:name="ref-storey2002direct"/>
     <w:p>
       <w:pPr>
         <w:pStyle w:val="Bibliography"/>
@@ -28866,7 +28909,7 @@
       <w:r>
         <w:t xml:space="preserve"> </w:t>
       </w:r>
-      <w:hyperlink r:id="rId109">
+      <w:hyperlink r:id="rId110">
         <w:r>
           <w:rPr>
             <w:rStyle w:val="Hyperlink"/>
@@ -28878,9 +28921,9 @@
         <w:t xml:space="preserve">.</w:t>
       </w:r>
     </w:p>
-    <w:bookmarkEnd w:id="110"/>
     <w:bookmarkEnd w:id="111"/>
     <w:bookmarkEnd w:id="112"/>
+    <w:bookmarkEnd w:id="113"/>
     <w:sectPr>
       <w:footnotePr>
         <w:numRestart w:val="eachSect"/>

</xml_diff>